<commit_message>
Agregando el Planteamiento del Problema y Solución Tecnológica a los informes
</commit_message>
<xml_diff>
--- a/Informe_Proyecto_Integrador.docx
+++ b/Informe_Proyecto_Integrador.docx
@@ -31,7 +31,7 @@
     </w:p>
     <w:p>
       <w:r>
-        <w:t>El presente documento detalla el desarrollo del Sistema de Registro de Novedades de Becarios, diseñado como proyecto integrador. La solución abarca las asignaturas de Programación Orientada a Objetos, Base de Datos I y Desarrollo Web Front End (UX/UI). Se ha construido una aplicación web robusta, modular y escalable, aplicando buenas prácticas de ingeniería de software.</w:t>
+        <w:t>El presente documento detalla el desarrollo del Sistema de Registro de Novedades de Becarios FAE, diseñado como proyecto integrador. La solución abarca las asignaturas de Programación Orientada a Objetos, Base de Datos I y Desarrollo Web Front End (UX/UI). Se ha construido una aplicación web robusta, modular y escalable, aplicando buenas prácticas de ingeniería de software.</w:t>
       </w:r>
     </w:p>
     <w:p>
@@ -39,7 +39,33 @@
         <w:pStyle w:val="Heading1"/>
       </w:pPr>
       <w:r>
-        <w:t>2. Base de Datos I</w:t>
+        <w:t>2. Planteamiento del Problema</w:t>
+      </w:r>
+    </w:p>
+    <w:p>
+      <w:r>
+        <w:t>Actualmente, el registro de asistencias y el seguimiento de novedades diarias de los becarios FAE se lleva a cabo mediante procesos manuales o herramientas ofimáticas descentralizadas. Esto provoca una pérdida significativa de información, falta de trazabilidad en las operaciones críticas, y dificulta la generación rápida de reportes gerenciales para la toma de decisiones. Además, la ausencia de un control de acceso estricto compromete la integridad y seguridad de los datos institucionales.</w:t>
+      </w:r>
+    </w:p>
+    <w:p>
+      <w:pPr>
+        <w:pStyle w:val="Heading1"/>
+      </w:pPr>
+      <w:r>
+        <w:t>3. Solución Tecnológica Propuesta</w:t>
+      </w:r>
+    </w:p>
+    <w:p>
+      <w:r>
+        <w:t>Para solventar las deficiencias identificadas, se ha desarrollado una plataforma web centralizada, escalable y altamente segura. Este sistema automatiza la recopilación de novedades diarias, aplica reglas de negocio para asegurar la integridad de la información, y permite la generación de reportes consolidados en tiempo real. La arquitectura del sistema garantiza la seguridad mediante un modelo de separación de responsabilidades y bases de datos aisladas.</w:t>
+      </w:r>
+    </w:p>
+    <w:p>
+      <w:pPr>
+        <w:pStyle w:val="Heading1"/>
+      </w:pPr>
+      <w:r>
+        <w:t>4. Base de Datos I</w:t>
       </w:r>
     </w:p>
     <w:p>
@@ -85,7 +111,7 @@
         <w:pStyle w:val="Heading1"/>
       </w:pPr>
       <w:r>
-        <w:t>3. Programación Orientada a Objetos (POO)</w:t>
+        <w:t>5. Programación Orientada a Objetos (POO)</w:t>
       </w:r>
     </w:p>
     <w:p>
@@ -126,7 +152,7 @@
         <w:pStyle w:val="Heading1"/>
       </w:pPr>
       <w:r>
-        <w:t>4. Desarrollo Web Front End (UX/UI)</w:t>
+        <w:t>6. Desarrollo Web Front End (UX/UI)</w:t>
       </w:r>
     </w:p>
     <w:p>
@@ -181,7 +207,7 @@
         <w:pStyle w:val="Heading1"/>
       </w:pPr>
       <w:r>
-        <w:t>5. Conclusiones</w:t>
+        <w:t>7. Conclusiones</w:t>
       </w:r>
     </w:p>
     <w:p>

</xml_diff>